<commit_message>
Documentación: stakeholders, Sección 1557, AI Act, canal de revisión, workshop de impacto social e informe N19
</commit_message>
<xml_diff>
--- a/results/reports/informe_proyecto_integrador.docx
+++ b/results/reports/informe_proyecto_integrador.docx
@@ -1606,7 +1606,7 @@
     <w:p>
       <w:pPr/>
       <w:r>
-        <w:t xml:space="preserve">El proyecto se completó como un sistema desplegable: un repositorio público con código modular, pruebas unitarias y documentación, y una interfaz web en Streamlit que estima el riesgo de una cita, explica cada predicción con valores SHAP y prioriza lotes de visitas. Además, se diagnosticó el ajuste del modelo con curvas de aprendizaje, se analizó la sensibilidad a los hiperparámetros con 68 configuraciones (el desempeño forma una meseta y la tasa de aprendizaje es el hiperparámetro más influyente) y se implementó una mitigación de equidad con umbrales por grupo de edad, que eleva la detección de inasistencias en los pacientes de 65 años o más de 30.6% a 74.0% y deja a todos los grupos entre 70.3% y 74.0%.</w:t>
+        <w:t>El proyecto se completó como un sistema desplegable: un repositorio público con código modular, pruebas unitarias y documentación, y una interfaz web en Streamlit que estima el riesgo de una cita, explica cada predicción con valores SHAP, prioriza lotes de visitas y ofrece un canal para solicitar la revisión humana de cada predicción. Además, se diagnosticó el ajuste del modelo con curvas de aprendizaje, se analizó la sensibilidad a los hiperparámetros con 68 configuraciones (el desempeño forma una meseta y la tasa de aprendizaje es el hiperparámetro más influyente) y se implementó una mitigación de equidad con umbrales por grupo de edad, que eleva la detección de inasistencias en los pacientes de 65 años o más de 30.6% a 74.0% y deja a todos los grupos entre 70.3% y 74.0%.</w:t>
       </w:r>
     </w:p>
     <w:p>
@@ -1659,7 +1659,7 @@
     <w:p>
       <w:pPr/>
       <w:r>
-        <w:t xml:space="preserve">The project was completed as a deployable system: a public repository with modular code, unit tests, and documentation, and a Streamlit web interface that estimates the risk of an appointment, explains each prediction with SHAP values, and prioritizes batches of visits. Model fit was diagnosed with learning curves, hyperparameter sensitivity was analyzed across 68 configurations (performance forms a plateau and the learning rate is the most influential hyperparameter), and a fairness mitigation based on age-group thresholds was implemented, raising no-show detection among patients aged 65 and older from 30.6% to 74.0% and keeping every age group between 70.3% and 74.0%.</w:t>
+        <w:t>The project was completed as a deployable system: a public repository with modular code, unit tests, and documentation, and a Streamlit web interface that estimates the risk of an appointment, explains each prediction with SHAP values, prioritizes batches of visits, and offers a channel to request human review of each prediction. Model fit was diagnosed with learning curves, hyperparameter sensitivity was analyzed across 68 configurations (performance forms a plateau and the learning rate is the most influential hyperparameter), and a fairness mitigation based on age-group thresholds was implemented, raising no-show detection among patients aged 65 and older from 30.6% to 74.0% and keeping every age group between 70.3% and 74.0%.</w:t>
       </w:r>
     </w:p>
     <w:p>
@@ -6657,13 +6657,13 @@
         <w:t xml:space="preserve">Nota. </w:t>
       </w:r>
       <w:r>
-        <w:t>Código con estilo PEP 8 verificado, documentado con docstrings y cubierto por 16 pruebas unitarias sobre el procesamiento de datos, el modelo y la interfaz.</w:t>
+        <w:t>Código con estilo PEP 8 verificado, documentado con docstrings y cubierto por 18 pruebas unitarias sobre el procesamiento de datos, el modelo y la interfaz.</w:t>
       </w:r>
     </w:p>
     <w:p>
       <w:pPr/>
       <w:r>
-        <w:t>La interfaz, desarrollada en Streamlit, permite a un coordinador de programación usar el modelo sin conocimientos técnicos (Figura 11). Tiene cuatro secciones: (1) predicción individual, con un formulario validado, tres ejemplos precargados, la probabilidad de inasistencia en un indicador, la categoría de riesgo con una sugerencia de acción y la explicación SHAP del caso; (2) priorización de un lote de visitas en formato CSV, que valida cada fila, marca la fracción a confirmar primero según riesgo por distancia y permite descargar el resultado; (3) historial y comparación de las predicciones de la sesión; y (4) una sección “Acerca del modelo” con métricas, equidad por grupo de edad y limitaciones. La interfaz aplica por defecto los umbrales por grupo de edad de la sección 13.3.3, maneja los errores con mensajes comprensibles, funciona en computadoras y celulares, en español e inglés, y no almacena ningún dato ingresado.</w:t>
+        <w:t>La interfaz, desarrollada en Streamlit, permite a un coordinador de programación usar el modelo sin conocimientos técnicos (Figura 11). Tiene cuatro secciones: (1) predicción individual, con un formulario validado, tres ejemplos precargados, la probabilidad de inasistencia en un indicador, la categoría de riesgo con una sugerencia de acción y la explicación SHAP del caso; (2) priorización de un lote de visitas en formato CSV, que valida cada fila, marca la fracción a confirmar primero según riesgo por distancia y permite descargar el resultado; (3) historial y comparación de las predicciones de la sesión; y (4) una sección “Acerca del modelo” con métricas, equidad por grupo de edad y limitaciones. La interfaz aplica por defecto los umbrales por grupo de edad de la sección 13.3.3, maneja los errores con mensajes comprensibles, funciona en computadoras y celulares, en español e inglés, y no almacena ningún dato ingresado. Además, cada predicción incluye un canal de revisión que funciona como mecanismo de apelación: el usuario registra un motivo predefinido (por ejemplo, que el paciente ya confirmó o que tiene una barrera de acceso) y un comentario sin datos identificables; la solicitud queda pendiente de revisión humana y se descarga en CSV desde el historial.</w:t>
       </w:r>
     </w:p>
     <w:p>
@@ -13790,6 +13790,12 @@
       </w:r>
     </w:p>
     <w:p>
+      <w:pPr/>
+      <w:r>
+        <w:t xml:space="preserve">En Estados Unidos aplica además una obligación específica para herramientas como esta: la regla de 2024 de la Sección 1557 de la Ley de Cuidado de Salud Asequible (45 CFR § 92.210) exige a las entidades de salud identificar las herramientas de apoyo a la decisión que usan variables de edad, sexo, raza u otras características protegidas y mitigar su riesgo de discriminación (U.S. Department of Health and Human Services, 2024). El modelo usa edad y sexo, por lo que un despliegue real exigiría inventariarlo y auditarlo; los umbrales por grupo de edad (sección 13.3.3) y el plan de monitoreo (sección 17.6) responden a esa obligación, en línea con la Ley contra la Discriminación por Edad (Age Discrimination Act of 1975, 1975). En la Unión Europea, el Reglamento de Inteligencia Artificial clasifica como de alto riesgo los sistemas que evalúan el acceso de las personas a servicios de salud (Reglamento [UE] 2024/1689, 2024); este sistema no decide el acceso, sino el orden de las confirmaciones, pero pasaría a esa categoría si se usara para conceder o negar visitas. Un despliegue real requeriría asesoría legal.</w:t>
+      </w:r>
+    </w:p>
+    <w:p>
       <w:pPr>
         <w:pStyle w:val="Heading2"/>
       </w:pPr>
@@ -13844,6 +13850,480 @@
       </w:r>
     </w:p>
     <w:p>
+      <w:pPr/>
+      <w:r>
+        <w:t>El análisis de impacto social del proyecto identificó cinco grupos de stakeholders (Tabla 19). Los dos con menos poder y voz (los afiliados y, entre ellos, los adultos mayores y los de bajos ingresos) son los más expuestos a los riesgos, por lo que la protección de sus intereses se incorporó al diseño: umbrales por grupo de edad, uso limitado a confirmar visitas y un canal de revisión de las predicciones.</w:t>
+      </w:r>
+    </w:p>
+    <w:p>
+      <w:pPr>
+        <w:pStyle w:val="EtiquetaAPA"/>
+      </w:pPr>
+      <w:r>
+        <w:t>Tabla 19</w:t>
+      </w:r>
+    </w:p>
+    <w:p>
+      <w:pPr>
+        <w:pStyle w:val="TituloAPA"/>
+      </w:pPr>
+      <w:r>
+        <w:t xml:space="preserve">Stakeholders del sistema: beneficios, riesgos y poder</w:t>
+      </w:r>
+    </w:p>
+    <w:tbl>
+      <w:tblPr>
+        <w:tblW w:type="auto" w:w="0"/>
+        <w:jc w:val="center"/>
+        <w:tblBorders>
+          <w:top w:val="single" w:sz="8" w:space="0" w:color="000000"/>
+          <w:bottom w:val="single" w:sz="8" w:space="0" w:color="000000"/>
+        </w:tblBorders>
+        <w:tblLayout w:type="fixed"/>
+        <w:tblCellMar>
+          <w:left w:w="70" w:type="dxa"/>
+          <w:right w:w="70" w:type="dxa"/>
+        </w:tblCellMar>
+        <w:tblLook w:firstColumn="1" w:firstRow="1" w:lastColumn="0" w:lastRow="0" w:noHBand="0" w:noVBand="1" w:val="04A0"/>
+      </w:tblPr>
+      <w:tblGrid>
+        <w:gridCol w:w="2340"/>
+        <w:gridCol w:w="2632"/>
+        <w:gridCol w:w="3217"/>
+        <w:gridCol w:w="1170"/>
+      </w:tblGrid>
+      <w:tr>
+        <w:trPr>
+          <w:cantSplit/>
+          <w:tblHeader/>
+        </w:trPr>
+        <w:tc>
+          <w:tcPr>
+            <w:tcW w:type="dxa" w:w="2340"/>
+            <w:tcBorders>
+              <w:bottom w:val="single" w:sz="8" w:space="0" w:color="000000"/>
+            </w:tcBorders>
+          </w:tcPr>
+          <w:p>
+            <w:pPr>
+              <w:pStyle w:val="TablaTexto"/>
+              <w:keepNext/>
+              <w:jc w:val="left"/>
+            </w:pPr>
+            <w:r>
+              <w:rPr>
+                <w:b/>
+              </w:rPr>
+              <w:t xml:space="preserve">Stakeholder</w:t>
+            </w:r>
+          </w:p>
+        </w:tc>
+        <w:tc>
+          <w:tcPr>
+            <w:tcW w:type="dxa" w:w="2632"/>
+            <w:tcBorders>
+              <w:bottom w:val="single" w:sz="8" w:space="0" w:color="000000"/>
+            </w:tcBorders>
+          </w:tcPr>
+          <w:p>
+            <w:pPr>
+              <w:pStyle w:val="TablaTexto"/>
+              <w:keepNext/>
+              <w:jc w:val="left"/>
+            </w:pPr>
+            <w:r>
+              <w:rPr>
+                <w:b/>
+              </w:rPr>
+              <w:t xml:space="preserve">Beneficio principal</w:t>
+            </w:r>
+          </w:p>
+        </w:tc>
+        <w:tc>
+          <w:tcPr>
+            <w:tcW w:type="dxa" w:w="3217"/>
+            <w:tcBorders>
+              <w:bottom w:val="single" w:sz="8" w:space="0" w:color="000000"/>
+            </w:tcBorders>
+          </w:tcPr>
+          <w:p>
+            <w:pPr>
+              <w:pStyle w:val="TablaTexto"/>
+              <w:keepNext/>
+              <w:jc w:val="left"/>
+            </w:pPr>
+            <w:r>
+              <w:rPr>
+                <w:b/>
+              </w:rPr>
+              <w:t xml:space="preserve">Riesgo principal</w:t>
+            </w:r>
+          </w:p>
+        </w:tc>
+        <w:tc>
+          <w:tcPr>
+            <w:tcW w:type="dxa" w:w="1170"/>
+            <w:tcBorders>
+              <w:bottom w:val="single" w:sz="8" w:space="0" w:color="000000"/>
+            </w:tcBorders>
+          </w:tcPr>
+          <w:p>
+            <w:pPr>
+              <w:pStyle w:val="TablaTexto"/>
+              <w:keepNext/>
+              <w:jc w:val="center"/>
+            </w:pPr>
+            <w:r>
+              <w:rPr>
+                <w:b/>
+              </w:rPr>
+              <w:t xml:space="preserve">Poder o voz</w:t>
+            </w:r>
+          </w:p>
+        </w:tc>
+      </w:tr>
+      <w:tr>
+        <w:trPr>
+          <w:cantSplit/>
+        </w:trPr>
+        <w:tc>
+          <w:tcPr>
+            <w:tcW w:type="dxa" w:w="2340"/>
+          </w:tcPr>
+          <w:p>
+            <w:pPr>
+              <w:pStyle w:val="TablaTexto"/>
+              <w:keepNext/>
+              <w:jc w:val="left"/>
+            </w:pPr>
+            <w:r>
+              <w:t xml:space="preserve">Afiliados (pacientes)</w:t>
+            </w:r>
+          </w:p>
+        </w:tc>
+        <w:tc>
+          <w:tcPr>
+            <w:tcW w:type="dxa" w:w="2632"/>
+          </w:tcPr>
+          <w:p>
+            <w:pPr>
+              <w:pStyle w:val="TablaTexto"/>
+              <w:keepNext/>
+              <w:jc w:val="left"/>
+            </w:pPr>
+            <w:r>
+              <w:t xml:space="preserve">Visita confirmada a tiempo y menos reprogramaciones</w:t>
+            </w:r>
+          </w:p>
+        </w:tc>
+        <w:tc>
+          <w:tcPr>
+            <w:tcW w:type="dxa" w:w="3217"/>
+          </w:tcPr>
+          <w:p>
+            <w:pPr>
+              <w:pStyle w:val="TablaTexto"/>
+              <w:keepNext/>
+              <w:jc w:val="left"/>
+            </w:pPr>
+            <w:r>
+              <w:t xml:space="preserve">Trato distinto según su riesgo; errores del modelo</w:t>
+            </w:r>
+          </w:p>
+        </w:tc>
+        <w:tc>
+          <w:tcPr>
+            <w:tcW w:type="dxa" w:w="1170"/>
+          </w:tcPr>
+          <w:p>
+            <w:pPr>
+              <w:pStyle w:val="TablaTexto"/>
+              <w:keepNext/>
+              <w:jc w:val="center"/>
+            </w:pPr>
+            <w:r>
+              <w:t xml:space="preserve">Bajo</w:t>
+            </w:r>
+          </w:p>
+        </w:tc>
+      </w:tr>
+      <w:tr>
+        <w:trPr>
+          <w:cantSplit/>
+        </w:trPr>
+        <w:tc>
+          <w:tcPr>
+            <w:tcW w:type="dxa" w:w="2340"/>
+          </w:tcPr>
+          <w:p>
+            <w:pPr>
+              <w:pStyle w:val="TablaTexto"/>
+              <w:keepNext/>
+              <w:jc w:val="left"/>
+            </w:pPr>
+            <w:r>
+              <w:t xml:space="preserve">Adultos mayores y afiliados de bajos ingresos</w:t>
+            </w:r>
+          </w:p>
+        </w:tc>
+        <w:tc>
+          <w:tcPr>
+            <w:tcW w:type="dxa" w:w="2632"/>
+          </w:tcPr>
+          <w:p>
+            <w:pPr>
+              <w:pStyle w:val="TablaTexto"/>
+              <w:keepNext/>
+              <w:jc w:val="left"/>
+            </w:pPr>
+            <w:r>
+              <w:t xml:space="preserve">Igual cobertura de confirmación con la mitigación</w:t>
+            </w:r>
+          </w:p>
+        </w:tc>
+        <w:tc>
+          <w:tcPr>
+            <w:tcW w:type="dxa" w:w="3217"/>
+          </w:tcPr>
+          <w:p>
+            <w:pPr>
+              <w:pStyle w:val="TablaTexto"/>
+              <w:keepNext/>
+              <w:jc w:val="left"/>
+            </w:pPr>
+            <w:r>
+              <w:t xml:space="preserve">Menor cobertura sin mitigación; el barrio actúa como indicador socioeconómico</w:t>
+            </w:r>
+          </w:p>
+        </w:tc>
+        <w:tc>
+          <w:tcPr>
+            <w:tcW w:type="dxa" w:w="1170"/>
+          </w:tcPr>
+          <w:p>
+            <w:pPr>
+              <w:pStyle w:val="TablaTexto"/>
+              <w:keepNext/>
+              <w:jc w:val="center"/>
+            </w:pPr>
+            <w:r>
+              <w:t xml:space="preserve">Bajo</w:t>
+            </w:r>
+          </w:p>
+        </w:tc>
+      </w:tr>
+      <w:tr>
+        <w:trPr>
+          <w:cantSplit/>
+        </w:trPr>
+        <w:tc>
+          <w:tcPr>
+            <w:tcW w:type="dxa" w:w="2340"/>
+          </w:tcPr>
+          <w:p>
+            <w:pPr>
+              <w:pStyle w:val="TablaTexto"/>
+              <w:keepNext/>
+              <w:jc w:val="left"/>
+            </w:pPr>
+            <w:r>
+              <w:t xml:space="preserve">Coordinadores de programación</w:t>
+            </w:r>
+          </w:p>
+        </w:tc>
+        <w:tc>
+          <w:tcPr>
+            <w:tcW w:type="dxa" w:w="2632"/>
+          </w:tcPr>
+          <w:p>
+            <w:pPr>
+              <w:pStyle w:val="TablaTexto"/>
+              <w:keepNext/>
+              <w:jc w:val="left"/>
+            </w:pPr>
+            <w:r>
+              <w:t xml:space="preserve">Lista priorizada y explicada</w:t>
+            </w:r>
+          </w:p>
+        </w:tc>
+        <w:tc>
+          <w:tcPr>
+            <w:tcW w:type="dxa" w:w="3217"/>
+          </w:tcPr>
+          <w:p>
+            <w:pPr>
+              <w:pStyle w:val="TablaTexto"/>
+              <w:keepNext/>
+              <w:jc w:val="left"/>
+            </w:pPr>
+            <w:r>
+              <w:t xml:space="preserve">Sesgo de automatización; más llamadas</w:t>
+            </w:r>
+          </w:p>
+        </w:tc>
+        <w:tc>
+          <w:tcPr>
+            <w:tcW w:type="dxa" w:w="1170"/>
+          </w:tcPr>
+          <w:p>
+            <w:pPr>
+              <w:pStyle w:val="TablaTexto"/>
+              <w:keepNext/>
+              <w:jc w:val="center"/>
+            </w:pPr>
+            <w:r>
+              <w:t xml:space="preserve">Medio</w:t>
+            </w:r>
+          </w:p>
+        </w:tc>
+      </w:tr>
+      <w:tr>
+        <w:trPr>
+          <w:cantSplit/>
+        </w:trPr>
+        <w:tc>
+          <w:tcPr>
+            <w:tcW w:type="dxa" w:w="2340"/>
+          </w:tcPr>
+          <w:p>
+            <w:pPr>
+              <w:pStyle w:val="TablaTexto"/>
+              <w:keepNext/>
+              <w:jc w:val="left"/>
+            </w:pPr>
+            <w:r>
+              <w:t xml:space="preserve">Nurse Practitioners</w:t>
+            </w:r>
+          </w:p>
+        </w:tc>
+        <w:tc>
+          <w:tcPr>
+            <w:tcW w:type="dxa" w:w="2632"/>
+          </w:tcPr>
+          <w:p>
+            <w:pPr>
+              <w:pStyle w:val="TablaTexto"/>
+              <w:keepNext/>
+              <w:jc w:val="left"/>
+            </w:pPr>
+            <w:r>
+              <w:t xml:space="preserve">Menos viajes a domicilios sin paciente</w:t>
+            </w:r>
+          </w:p>
+        </w:tc>
+        <w:tc>
+          <w:tcPr>
+            <w:tcW w:type="dxa" w:w="3217"/>
+          </w:tcPr>
+          <w:p>
+            <w:pPr>
+              <w:pStyle w:val="TablaTexto"/>
+              <w:keepNext/>
+              <w:jc w:val="left"/>
+            </w:pPr>
+            <w:r>
+              <w:t xml:space="preserve">Uso de las métricas para evaluarlos</w:t>
+            </w:r>
+          </w:p>
+        </w:tc>
+        <w:tc>
+          <w:tcPr>
+            <w:tcW w:type="dxa" w:w="1170"/>
+          </w:tcPr>
+          <w:p>
+            <w:pPr>
+              <w:pStyle w:val="TablaTexto"/>
+              <w:keepNext/>
+              <w:jc w:val="center"/>
+            </w:pPr>
+            <w:r>
+              <w:t xml:space="preserve">Medio</w:t>
+            </w:r>
+          </w:p>
+        </w:tc>
+      </w:tr>
+      <w:tr>
+        <w:trPr>
+          <w:cantSplit/>
+        </w:trPr>
+        <w:tc>
+          <w:tcPr>
+            <w:tcW w:type="dxa" w:w="2340"/>
+          </w:tcPr>
+          <w:p>
+            <w:pPr>
+              <w:pStyle w:val="TablaTexto"/>
+              <w:keepNext/>
+              <w:jc w:val="left"/>
+            </w:pPr>
+            <w:r>
+              <w:t xml:space="preserve">Organización (aseguradora)</w:t>
+            </w:r>
+          </w:p>
+        </w:tc>
+        <w:tc>
+          <w:tcPr>
+            <w:tcW w:type="dxa" w:w="2632"/>
+          </w:tcPr>
+          <w:p>
+            <w:pPr>
+              <w:pStyle w:val="TablaTexto"/>
+              <w:keepNext/>
+              <w:jc w:val="left"/>
+            </w:pPr>
+            <w:r>
+              <w:t xml:space="preserve">Más visitas completadas con la misma dotación</w:t>
+            </w:r>
+          </w:p>
+        </w:tc>
+        <w:tc>
+          <w:tcPr>
+            <w:tcW w:type="dxa" w:w="3217"/>
+          </w:tcPr>
+          <w:p>
+            <w:pPr>
+              <w:pStyle w:val="TablaTexto"/>
+              <w:keepNext/>
+              <w:jc w:val="left"/>
+            </w:pPr>
+            <w:r>
+              <w:t xml:space="preserve">Riesgo legal y reputacional por discriminación o privacidad</w:t>
+            </w:r>
+          </w:p>
+        </w:tc>
+        <w:tc>
+          <w:tcPr>
+            <w:tcW w:type="dxa" w:w="1170"/>
+          </w:tcPr>
+          <w:p>
+            <w:pPr>
+              <w:pStyle w:val="TablaTexto"/>
+              <w:keepNext/>
+              <w:jc w:val="center"/>
+            </w:pPr>
+            <w:r>
+              <w:t xml:space="preserve">Alto</w:t>
+            </w:r>
+          </w:p>
+        </w:tc>
+      </w:tr>
+    </w:tbl>
+    <w:p>
+      <w:pPr>
+        <w:pStyle w:val="NotaAPA"/>
+        <w:spacing w:before="80"/>
+      </w:pPr>
+      <w:r>
+        <w:rPr>
+          <w:i/>
+        </w:rPr>
+        <w:t xml:space="preserve">Nota. </w:t>
+      </w:r>
+      <w:r>
+        <w:t>Análisis completo en el workshop de impacto social y responsabilidad de la asignatura.</w:t>
+      </w:r>
+    </w:p>
+    <w:p>
       <w:pPr>
         <w:pStyle w:val="Heading2"/>
       </w:pPr>
@@ -13868,7 +14348,7 @@
     <w:p>
       <w:pPr/>
       <w:r>
-        <w:t xml:space="preserve">Si el modelo falla, la responsabilidad es de la organización que lo despliega y del equipo que lo valida, no del algoritmo: el sistema es de apoyo y el coordinador conserva la decisión final sobre cada visita. Como mecanismos de rendición de cuentas, los modelos están versionados, la configuración y las semillas están documentadas, los eventos se registran y el código cuenta con pruebas automáticas. Para un uso real se propone el siguiente plan de monitoreo:</w:t>
+        <w:t>Si el modelo falla, la responsabilidad es de la organización que lo despliega y del equipo que lo valida, no del algoritmo: el sistema es de apoyo y el coordinador conserva la decisión final sobre cada visita. Como mecanismos de rendición de cuentas, los modelos están versionados, la configuración y las semillas están documentadas, los eventos se registran, el código cuenta con pruebas automáticas y la interfaz ofrece un canal para solicitar la revisión humana de cada predicción, que funciona como mecanismo de apelación. Para un uso real se propone el siguiente plan de monitoreo:</w:t>
       </w:r>
     </w:p>
     <w:p>
@@ -13922,7 +14402,7 @@
     <w:p>
       <w:pPr/>
       <w:r>
-        <w:t xml:space="preserve">El riesgo principal de mal uso es emplear la probabilidad de inasistencia para negar, retrasar o cancelar visitas a los pacientes que más faltan, que suelen ser quienes enfrentan más barreras de acceso: el efecto contrario al propósito del sistema. Otros usos indebidos serían sobreagendar citas contando con que ciertos pacientes faltarán, perfilar barrios o grupos socioeconómicos, o usar las probabilidades en decisiones de cobertura o de precios de seguros. Como salvaguardas, la interfaz muestra una advertencia permanente que limita el uso a ordenar las confirmaciones, no permite consultar ni exportar riesgos agregados por barrio, y la documentación prohíbe los usos anteriores; además, la licencia del conjunto de datos impide su uso comercial.</w:t>
+        <w:t>El riesgo principal de mal uso es emplear la probabilidad de inasistencia para negar, retrasar o cancelar visitas a los pacientes que más faltan, que suelen ser quienes enfrentan más barreras de acceso: el efecto contrario al propósito del sistema. Otros usos indebidos serían sobreagendar citas contando con que ciertos pacientes faltarán, perfilar barrios o grupos socioeconómicos, o usar las probabilidades en decisiones de cobertura o de precios de seguros. Como salvaguardas, la interfaz muestra una advertencia permanente que limita el uso a ordenar las confirmaciones, no permite consultar ni exportar riesgos agregados por barrio, y la documentación prohíbe los usos anteriores; además, la licencia del conjunto de datos impide su uso comercial. Además, ante una predicción que parezca errónea o injusta, el usuario puede registrar una solicitud de revisión humana desde la propia interfaz.</w:t>
       </w:r>
     </w:p>
     <w:p>
@@ -14036,7 +14516,7 @@
         <w:pStyle w:val="ListBullet"/>
       </w:pPr>
       <w:r>
-        <w:t xml:space="preserve">El proyecto se entrega como un sistema funcional y reproducible: un repositorio con código modular, 16 pruebas unitarias y documentación, y una interfaz web que permite a un usuario no técnico estimar, explicar y priorizar el riesgo de las visitas.</w:t>
+        <w:t>El proyecto se entrega como un sistema funcional y reproducible: un repositorio con código modular, 18 pruebas unitarias y documentación, y una interfaz web que permite a un usuario no técnico estimar, explicar y priorizar el riesgo de las visitas.</w:t>
       </w:r>
     </w:p>
     <w:p>
@@ -14126,7 +14606,7 @@
     <w:p>
       <w:pPr/>
       <w:r>
-        <w:t>La sustentación final no se realiza en vivo. Consta de dos videos: un video pitch de un máximo de 5 minutos, que incluye la grabación de pantalla de la interfaz funcionando en su versión publicada, y un video de respuestas a las preguntas que la docente asigna en la última semana de clases. El pitch se apoya en un máximo de 9 diapositivas y muestra el enlace al repositorio y un código QR. La Tabla 19 detalla sus bloques.</w:t>
+        <w:t>La sustentación final no se realiza en vivo. Consta de dos videos: un video pitch de un máximo de 5 minutos, que incluye la grabación de pantalla de la interfaz funcionando en su versión publicada, y un video de respuestas a las preguntas que la docente asigna en la última semana de clases. El pitch se apoya en un máximo de 9 diapositivas y muestra el enlace al repositorio y un código QR. La Tabla 20 detalla sus bloques.</w:t>
       </w:r>
     </w:p>
     <w:p>
@@ -14134,7 +14614,7 @@
         <w:pStyle w:val="EtiquetaAPA"/>
       </w:pPr>
       <w:r>
-        <w:t>Tabla 19</w:t>
+        <w:t>Tabla 20</w:t>
       </w:r>
     </w:p>
     <w:p>
@@ -14612,6 +15092,14 @@
         <w:pStyle w:val="Referencia"/>
       </w:pPr>
       <w:r>
+        <w:t xml:space="preserve">Age Discrimination Act of 1975, 42 U.S.C. §§ 6101–6107 (1975). https://www.law.cornell.edu/uscode/text/42/chapter-76</w:t>
+      </w:r>
+    </w:p>
+    <w:p>
+      <w:pPr>
+        <w:pStyle w:val="Referencia"/>
+      </w:pPr>
+      <w:r>
         <w:t xml:space="preserve">Beauchamp, T. L., y Childress, J. F. (2019). </w:t>
       </w:r>
       <w:r>
@@ -14960,6 +15448,23 @@
         <w:pStyle w:val="Referencia"/>
       </w:pPr>
       <w:r>
+        <w:t xml:space="preserve">Reglamento (UE) 2024/1689 del Parlamento Europeo y del Consejo, de 13 de junio de 2024, por el que se establecen normas armonizadas en materia de inteligencia artificial. (2024). </w:t>
+      </w:r>
+      <w:r>
+        <w:rPr>
+          <w:i/>
+        </w:rPr>
+        <w:t xml:space="preserve">Diario Oficial de la Unión Europea</w:t>
+      </w:r>
+      <w:r>
+        <w:t xml:space="preserve">, L 2024/1689. https://eur-lex.europa.eu/eli/reg/2024/1689/oj</w:t>
+      </w:r>
+    </w:p>
+    <w:p>
+      <w:pPr>
+        <w:pStyle w:val="Referencia"/>
+      </w:pPr>
+      <w:r>
         <w:t xml:space="preserve">Robotham, D., Satkunanathan, S., Reynolds, J., Stahl, D., y Wykes, T. (2016). Using digital notifications to improve attendance in clinic: Systematic review and meta-analysis. </w:t>
       </w:r>
       <w:r>
@@ -15028,6 +15533,23 @@
         <w:pStyle w:val="Referencia"/>
       </w:pPr>
       <w:r>
+        <w:t xml:space="preserve">U.S. Department of Health and Human Services. (2024). Nondiscrimination in health programs and activities. </w:t>
+      </w:r>
+      <w:r>
+        <w:rPr>
+          <w:i/>
+        </w:rPr>
+        <w:t xml:space="preserve">Federal Register, 89</w:t>
+      </w:r>
+      <w:r>
+        <w:t xml:space="preserve">(88), 37522–37703. https://www.federalregister.gov/d/2024-08711</w:t>
+      </w:r>
+    </w:p>
+    <w:p>
+      <w:pPr>
+        <w:pStyle w:val="Referencia"/>
+      </w:pPr>
+      <w:r>
         <w:t xml:space="preserve">U.S. Department of Health and Human Services, Office for Civil Rights. (2013). </w:t>
       </w:r>
       <w:r>
@@ -15073,6 +15595,14 @@
         <w:pStyle w:val="ListBullet"/>
       </w:pPr>
       <w:r>
+        <w:t xml:space="preserve">Apelación (canal de revisión): mecanismo que permite a un usuario objetar una predicción del sistema para que una persona la revise.</w:t>
+      </w:r>
+    </w:p>
+    <w:p>
+      <w:pPr>
+        <w:pStyle w:val="ListBullet"/>
+      </w:pPr>
+      <w:r>
         <w:t>AUC (área bajo la curva ROC): métrica que mide la capacidad de un modelo de clasificación de ordenar correctamente los casos positivos por encima de los negativos, independiente del umbral de decisión.</w:t>
       </w:r>
     </w:p>
@@ -15364,7 +15894,7 @@
     <w:p>
       <w:pPr/>
       <w:r>
-        <w:t>El repositorio organiza el código del Anexo C en módulos (Tabla 7), incluye los cinco notebooks ejecutados, los modelos entrenados, la interfaz, 16 pruebas unitarias (pytest) y la documentación técnica, y reproduce exactamente las cifras de este documento. Las secciones 11.5, 13.3.3, 13.4 y 14.5 y los valores SHAP de la sección 11.3 se obtuvieron con ese repositorio, sobre los mismos datos, la misma partición y el mismo modelo final. Para instalarlo y ejecutarlo: pip install -r requirements.txt; streamlit run app/app.py para la interfaz; python -m src.train y python -m src.evaluate para reentrenar y evaluar; y pytest para las pruebas.</w:t>
+        <w:t>El repositorio organiza el código del Anexo C en módulos (Tabla 7), incluye los cinco notebooks ejecutados, los modelos entrenados, la interfaz, 18 pruebas unitarias (pytest) y la documentación técnica, y reproduce exactamente las cifras de este documento. Las secciones 11.5, 13.3.3, 13.4 y 14.5 y los valores SHAP de la sección 11.3 se obtuvieron con ese repositorio, sobre los mismos datos, la misma partición y el mismo modelo final. Para instalarlo y ejecutarlo: pip install -r requirements.txt; streamlit run app/app.py para la interfaz; python -m src.train y python -m src.evaluate para reentrenar y evaluar; y pytest para las pruebas.</w:t>
       </w:r>
     </w:p>
     <w:p>

</xml_diff>

<commit_message>
Informe N19 con índice completo y citas de todas las figuras y tablas; workshop con citas verificadas
</commit_message>
<xml_diff>
--- a/results/reports/informe_proyecto_integrador.docx
+++ b/results/reports/informe_proyecto_integrador.docx
@@ -384,6 +384,22 @@
     </w:p>
     <w:p>
       <w:pPr>
+        <w:pStyle w:val="TOC2"/>
+      </w:pPr>
+      <w:hyperlink w:anchor="_Toc20000" w:history="1">
+        <w:r>
+          <w:t xml:space="preserve">2.8 Explicabilidad, diagnóstico del ajuste y análisis de sensibilidad</w:t>
+        </w:r>
+        <w:r>
+          <w:tab/>
+        </w:r>
+        <w:r>
+          <w:t xml:space="preserve">19</w:t>
+        </w:r>
+      </w:hyperlink>
+    </w:p>
+    <w:p>
+      <w:pPr>
         <w:pStyle w:val="TOC1"/>
       </w:pPr>
       <w:hyperlink w:anchor="_Toc09018" w:history="1">
@@ -394,7 +410,7 @@
           <w:tab/>
         </w:r>
         <w:r>
-          <w:t xml:space="preserve">19</w:t>
+          <w:t xml:space="preserve">20</w:t>
         </w:r>
       </w:hyperlink>
     </w:p>
@@ -410,7 +426,7 @@
           <w:tab/>
         </w:r>
         <w:r>
-          <w:t xml:space="preserve">19</w:t>
+          <w:t xml:space="preserve">20</w:t>
         </w:r>
       </w:hyperlink>
     </w:p>
@@ -426,7 +442,7 @@
           <w:tab/>
         </w:r>
         <w:r>
-          <w:t xml:space="preserve">21</w:t>
+          <w:t xml:space="preserve">22</w:t>
         </w:r>
       </w:hyperlink>
     </w:p>
@@ -442,7 +458,7 @@
           <w:tab/>
         </w:r>
         <w:r>
-          <w:t xml:space="preserve">22</w:t>
+          <w:t xml:space="preserve">23</w:t>
         </w:r>
       </w:hyperlink>
     </w:p>
@@ -490,7 +506,7 @@
           <w:tab/>
         </w:r>
         <w:r>
-          <w:t xml:space="preserve">24</w:t>
+          <w:t xml:space="preserve">25</w:t>
         </w:r>
       </w:hyperlink>
     </w:p>
@@ -506,7 +522,7 @@
           <w:tab/>
         </w:r>
         <w:r>
-          <w:t xml:space="preserve">25</w:t>
+          <w:t xml:space="preserve">26</w:t>
         </w:r>
       </w:hyperlink>
     </w:p>
@@ -570,7 +586,7 @@
           <w:tab/>
         </w:r>
         <w:r>
-          <w:t xml:space="preserve">27</w:t>
+          <w:t xml:space="preserve">28</w:t>
         </w:r>
       </w:hyperlink>
     </w:p>
@@ -602,7 +618,7 @@
           <w:tab/>
         </w:r>
         <w:r>
-          <w:t xml:space="preserve">29</w:t>
+          <w:t xml:space="preserve">30</w:t>
         </w:r>
       </w:hyperlink>
     </w:p>
@@ -618,7 +634,7 @@
           <w:tab/>
         </w:r>
         <w:r>
-          <w:t xml:space="preserve">29</w:t>
+          <w:t xml:space="preserve">30</w:t>
         </w:r>
       </w:hyperlink>
     </w:p>
@@ -634,7 +650,7 @@
           <w:tab/>
         </w:r>
         <w:r>
-          <w:t xml:space="preserve">30</w:t>
+          <w:t xml:space="preserve">31</w:t>
         </w:r>
       </w:hyperlink>
     </w:p>
@@ -650,7 +666,7 @@
           <w:tab/>
         </w:r>
         <w:r>
-          <w:t xml:space="preserve">30</w:t>
+          <w:t xml:space="preserve">31</w:t>
         </w:r>
       </w:hyperlink>
     </w:p>
@@ -666,7 +682,7 @@
           <w:tab/>
         </w:r>
         <w:r>
-          <w:t xml:space="preserve">31</w:t>
+          <w:t xml:space="preserve">32</w:t>
         </w:r>
       </w:hyperlink>
     </w:p>
@@ -682,7 +698,7 @@
           <w:tab/>
         </w:r>
         <w:r>
-          <w:t xml:space="preserve">31</w:t>
+          <w:t xml:space="preserve">32</w:t>
         </w:r>
       </w:hyperlink>
     </w:p>
@@ -698,7 +714,7 @@
           <w:tab/>
         </w:r>
         <w:r>
-          <w:t xml:space="preserve">31</w:t>
+          <w:t xml:space="preserve">32</w:t>
         </w:r>
       </w:hyperlink>
     </w:p>
@@ -714,7 +730,7 @@
           <w:tab/>
         </w:r>
         <w:r>
-          <w:t xml:space="preserve">33</w:t>
+          <w:t xml:space="preserve">34</w:t>
         </w:r>
       </w:hyperlink>
     </w:p>
@@ -730,7 +746,7 @@
           <w:tab/>
         </w:r>
         <w:r>
-          <w:t xml:space="preserve">33</w:t>
+          <w:t xml:space="preserve">34</w:t>
         </w:r>
       </w:hyperlink>
     </w:p>
@@ -746,7 +762,7 @@
           <w:tab/>
         </w:r>
         <w:r>
-          <w:t xml:space="preserve">33</w:t>
+          <w:t xml:space="preserve">34</w:t>
         </w:r>
       </w:hyperlink>
     </w:p>
@@ -762,7 +778,7 @@
           <w:tab/>
         </w:r>
         <w:r>
-          <w:t xml:space="preserve">34</w:t>
+          <w:t xml:space="preserve">35</w:t>
         </w:r>
       </w:hyperlink>
     </w:p>
@@ -778,7 +794,7 @@
           <w:tab/>
         </w:r>
         <w:r>
-          <w:t xml:space="preserve">35</w:t>
+          <w:t xml:space="preserve">36</w:t>
         </w:r>
       </w:hyperlink>
     </w:p>
@@ -794,7 +810,7 @@
           <w:tab/>
         </w:r>
         <w:r>
-          <w:t xml:space="preserve">35</w:t>
+          <w:t xml:space="preserve">36</w:t>
         </w:r>
       </w:hyperlink>
     </w:p>
@@ -810,7 +826,7 @@
           <w:tab/>
         </w:r>
         <w:r>
-          <w:t xml:space="preserve">36</w:t>
+          <w:t xml:space="preserve">37</w:t>
         </w:r>
       </w:hyperlink>
     </w:p>
@@ -826,7 +842,7 @@
           <w:tab/>
         </w:r>
         <w:r>
-          <w:t xml:space="preserve">38</w:t>
+          <w:t xml:space="preserve">39</w:t>
         </w:r>
       </w:hyperlink>
     </w:p>
@@ -842,7 +858,7 @@
           <w:tab/>
         </w:r>
         <w:r>
-          <w:t xml:space="preserve">39</w:t>
+          <w:t xml:space="preserve">40</w:t>
         </w:r>
       </w:hyperlink>
     </w:p>
@@ -858,7 +874,7 @@
           <w:tab/>
         </w:r>
         <w:r>
-          <w:t xml:space="preserve">40</w:t>
+          <w:t xml:space="preserve">41</w:t>
         </w:r>
       </w:hyperlink>
     </w:p>
@@ -874,7 +890,7 @@
           <w:tab/>
         </w:r>
         <w:r>
-          <w:t xml:space="preserve">40</w:t>
+          <w:t xml:space="preserve">41</w:t>
         </w:r>
       </w:hyperlink>
     </w:p>
@@ -890,7 +906,7 @@
           <w:tab/>
         </w:r>
         <w:r>
-          <w:t xml:space="preserve">40</w:t>
+          <w:t xml:space="preserve">41</w:t>
         </w:r>
       </w:hyperlink>
     </w:p>
@@ -906,7 +922,7 @@
           <w:tab/>
         </w:r>
         <w:r>
-          <w:t xml:space="preserve">41</w:t>
+          <w:t xml:space="preserve">42</w:t>
         </w:r>
       </w:hyperlink>
     </w:p>
@@ -922,7 +938,7 @@
           <w:tab/>
         </w:r>
         <w:r>
-          <w:t xml:space="preserve">42</w:t>
+          <w:t xml:space="preserve">43</w:t>
         </w:r>
       </w:hyperlink>
     </w:p>
@@ -938,7 +954,7 @@
           <w:tab/>
         </w:r>
         <w:r>
-          <w:t xml:space="preserve">42</w:t>
+          <w:t xml:space="preserve">43</w:t>
         </w:r>
       </w:hyperlink>
     </w:p>
@@ -954,7 +970,7 @@
           <w:tab/>
         </w:r>
         <w:r>
-          <w:t xml:space="preserve">42</w:t>
+          <w:t xml:space="preserve">43</w:t>
         </w:r>
       </w:hyperlink>
     </w:p>
@@ -970,7 +986,7 @@
           <w:tab/>
         </w:r>
         <w:r>
-          <w:t xml:space="preserve">44</w:t>
+          <w:t xml:space="preserve">45</w:t>
         </w:r>
       </w:hyperlink>
     </w:p>
@@ -986,7 +1002,23 @@
           <w:tab/>
         </w:r>
         <w:r>
-          <w:t xml:space="preserve">45</w:t>
+          <w:t xml:space="preserve">47</w:t>
+        </w:r>
+      </w:hyperlink>
+    </w:p>
+    <w:p>
+      <w:pPr>
+        <w:pStyle w:val="TOC2"/>
+      </w:pPr>
+      <w:hyperlink w:anchor="_Toc20001" w:history="1">
+        <w:r>
+          <w:t xml:space="preserve">11.5 Implementación del sistema e interfaz de usuario</w:t>
+        </w:r>
+        <w:r>
+          <w:tab/>
+        </w:r>
+        <w:r>
+          <w:t xml:space="preserve">48</w:t>
         </w:r>
       </w:hyperlink>
     </w:p>
@@ -1002,7 +1034,7 @@
           <w:tab/>
         </w:r>
         <w:r>
-          <w:t xml:space="preserve">47</w:t>
+          <w:t xml:space="preserve">52</w:t>
         </w:r>
       </w:hyperlink>
     </w:p>
@@ -1018,7 +1050,7 @@
           <w:tab/>
         </w:r>
         <w:r>
-          <w:t xml:space="preserve">47</w:t>
+          <w:t xml:space="preserve">52</w:t>
         </w:r>
       </w:hyperlink>
     </w:p>
@@ -1034,7 +1066,7 @@
           <w:tab/>
         </w:r>
         <w:r>
-          <w:t xml:space="preserve">47</w:t>
+          <w:t xml:space="preserve">52</w:t>
         </w:r>
       </w:hyperlink>
     </w:p>
@@ -1050,7 +1082,7 @@
           <w:tab/>
         </w:r>
         <w:r>
-          <w:t xml:space="preserve">47</w:t>
+          <w:t xml:space="preserve">52</w:t>
         </w:r>
       </w:hyperlink>
     </w:p>
@@ -1066,7 +1098,7 @@
           <w:tab/>
         </w:r>
         <w:r>
-          <w:t xml:space="preserve">48</w:t>
+          <w:t xml:space="preserve">53</w:t>
         </w:r>
       </w:hyperlink>
     </w:p>
@@ -1082,7 +1114,23 @@
           <w:tab/>
         </w:r>
         <w:r>
-          <w:t xml:space="preserve">48</w:t>
+          <w:t xml:space="preserve">54</w:t>
+        </w:r>
+      </w:hyperlink>
+    </w:p>
+    <w:p>
+      <w:pPr>
+        <w:pStyle w:val="TOC2"/>
+      </w:pPr>
+      <w:hyperlink w:anchor="_Toc20002" w:history="1">
+        <w:r>
+          <w:t xml:space="preserve">13.4 Diagnóstico del ajuste con curvas de aprendizaje</w:t>
+        </w:r>
+        <w:r>
+          <w:tab/>
+        </w:r>
+        <w:r>
+          <w:t xml:space="preserve">59</w:t>
         </w:r>
       </w:hyperlink>
     </w:p>
@@ -1098,7 +1146,7 @@
           <w:tab/>
         </w:r>
         <w:r>
-          <w:t xml:space="preserve">52</w:t>
+          <w:t xml:space="preserve">64</w:t>
         </w:r>
       </w:hyperlink>
     </w:p>
@@ -1114,7 +1162,7 @@
           <w:tab/>
         </w:r>
         <w:r>
-          <w:t xml:space="preserve">52</w:t>
+          <w:t xml:space="preserve">64</w:t>
         </w:r>
       </w:hyperlink>
     </w:p>
@@ -1130,7 +1178,7 @@
           <w:tab/>
         </w:r>
         <w:r>
-          <w:t xml:space="preserve">53</w:t>
+          <w:t xml:space="preserve">65</w:t>
         </w:r>
       </w:hyperlink>
     </w:p>
@@ -1146,7 +1194,7 @@
           <w:tab/>
         </w:r>
         <w:r>
-          <w:t xml:space="preserve">53</w:t>
+          <w:t xml:space="preserve">65</w:t>
         </w:r>
       </w:hyperlink>
     </w:p>
@@ -1162,7 +1210,23 @@
           <w:tab/>
         </w:r>
         <w:r>
-          <w:t xml:space="preserve">55</w:t>
+          <w:t xml:space="preserve">67</w:t>
+        </w:r>
+      </w:hyperlink>
+    </w:p>
+    <w:p>
+      <w:pPr>
+        <w:pStyle w:val="TOC2"/>
+      </w:pPr>
+      <w:hyperlink w:anchor="_Toc20003" w:history="1">
+        <w:r>
+          <w:t xml:space="preserve">14.5 Análisis de sensibilidad de hiperparámetros</w:t>
+        </w:r>
+        <w:r>
+          <w:tab/>
+        </w:r>
+        <w:r>
+          <w:t xml:space="preserve">67</w:t>
         </w:r>
       </w:hyperlink>
     </w:p>
@@ -1178,7 +1242,7 @@
           <w:tab/>
         </w:r>
         <w:r>
-          <w:t xml:space="preserve">56</w:t>
+          <w:t xml:space="preserve">71</w:t>
         </w:r>
       </w:hyperlink>
     </w:p>
@@ -1194,7 +1258,7 @@
           <w:tab/>
         </w:r>
         <w:r>
-          <w:t xml:space="preserve">56</w:t>
+          <w:t xml:space="preserve">71</w:t>
         </w:r>
       </w:hyperlink>
     </w:p>
@@ -1210,7 +1274,7 @@
           <w:tab/>
         </w:r>
         <w:r>
-          <w:t xml:space="preserve">57</w:t>
+          <w:t xml:space="preserve">73</w:t>
         </w:r>
       </w:hyperlink>
     </w:p>
@@ -1226,7 +1290,7 @@
           <w:tab/>
         </w:r>
         <w:r>
-          <w:t xml:space="preserve">58</w:t>
+          <w:t xml:space="preserve">74</w:t>
         </w:r>
       </w:hyperlink>
     </w:p>
@@ -1242,7 +1306,7 @@
           <w:tab/>
         </w:r>
         <w:r>
-          <w:t xml:space="preserve">59</w:t>
+          <w:t xml:space="preserve">75</w:t>
         </w:r>
       </w:hyperlink>
     </w:p>
@@ -1258,7 +1322,7 @@
           <w:tab/>
         </w:r>
         <w:r>
-          <w:t xml:space="preserve">61</w:t>
+          <w:t xml:space="preserve">77</w:t>
         </w:r>
       </w:hyperlink>
     </w:p>
@@ -1274,7 +1338,7 @@
           <w:tab/>
         </w:r>
         <w:r>
-          <w:t xml:space="preserve">61</w:t>
+          <w:t xml:space="preserve">77</w:t>
         </w:r>
       </w:hyperlink>
     </w:p>
@@ -1290,7 +1354,7 @@
           <w:tab/>
         </w:r>
         <w:r>
-          <w:t xml:space="preserve">61</w:t>
+          <w:t xml:space="preserve">77</w:t>
         </w:r>
       </w:hyperlink>
     </w:p>
@@ -1306,7 +1370,7 @@
           <w:tab/>
         </w:r>
         <w:r>
-          <w:t xml:space="preserve">61</w:t>
+          <w:t xml:space="preserve">78</w:t>
         </w:r>
       </w:hyperlink>
     </w:p>
@@ -1322,7 +1386,7 @@
           <w:tab/>
         </w:r>
         <w:r>
-          <w:t xml:space="preserve">62</w:t>
+          <w:t xml:space="preserve">79</w:t>
         </w:r>
       </w:hyperlink>
     </w:p>
@@ -1338,7 +1402,71 @@
           <w:tab/>
         </w:r>
         <w:r>
-          <w:t xml:space="preserve">63</w:t>
+          <w:t xml:space="preserve">80</w:t>
+        </w:r>
+      </w:hyperlink>
+    </w:p>
+    <w:p>
+      <w:pPr>
+        <w:pStyle w:val="TOC2"/>
+      </w:pPr>
+      <w:hyperlink w:anchor="_Toc20004" w:history="1">
+        <w:r>
+          <w:t xml:space="preserve">17.5 Transparencia y explicabilidad</w:t>
+        </w:r>
+        <w:r>
+          <w:tab/>
+        </w:r>
+        <w:r>
+          <w:t xml:space="preserve">81</w:t>
+        </w:r>
+      </w:hyperlink>
+    </w:p>
+    <w:p>
+      <w:pPr>
+        <w:pStyle w:val="TOC2"/>
+      </w:pPr>
+      <w:hyperlink w:anchor="_Toc20005" w:history="1">
+        <w:r>
+          <w:t xml:space="preserve">17.6 Responsabilidad y monitoreo</w:t>
+        </w:r>
+        <w:r>
+          <w:tab/>
+        </w:r>
+        <w:r>
+          <w:t xml:space="preserve">81</w:t>
+        </w:r>
+      </w:hyperlink>
+    </w:p>
+    <w:p>
+      <w:pPr>
+        <w:pStyle w:val="TOC2"/>
+      </w:pPr>
+      <w:hyperlink w:anchor="_Toc20006" w:history="1">
+        <w:r>
+          <w:t xml:space="preserve">17.7 Uso dual y mal uso</w:t>
+        </w:r>
+        <w:r>
+          <w:tab/>
+        </w:r>
+        <w:r>
+          <w:t xml:space="preserve">82</w:t>
+        </w:r>
+      </w:hyperlink>
+    </w:p>
+    <w:p>
+      <w:pPr>
+        <w:pStyle w:val="TOC2"/>
+      </w:pPr>
+      <w:hyperlink w:anchor="_Toc20007" w:history="1">
+        <w:r>
+          <w:t xml:space="preserve">17.8 Casos en que no debe usarse el modelo</w:t>
+        </w:r>
+        <w:r>
+          <w:tab/>
+        </w:r>
+        <w:r>
+          <w:t xml:space="preserve">83</w:t>
         </w:r>
       </w:hyperlink>
     </w:p>
@@ -1354,7 +1482,7 @@
           <w:tab/>
         </w:r>
         <w:r>
-          <w:t xml:space="preserve">63</w:t>
+          <w:t xml:space="preserve">83</w:t>
         </w:r>
       </w:hyperlink>
     </w:p>
@@ -1370,7 +1498,7 @@
           <w:tab/>
         </w:r>
         <w:r>
-          <w:t xml:space="preserve">64</w:t>
+          <w:t xml:space="preserve">85</w:t>
         </w:r>
       </w:hyperlink>
     </w:p>
@@ -1386,7 +1514,7 @@
           <w:tab/>
         </w:r>
         <w:r>
-          <w:t xml:space="preserve">65</w:t>
+          <w:t xml:space="preserve">86</w:t>
         </w:r>
       </w:hyperlink>
     </w:p>
@@ -1402,7 +1530,7 @@
           <w:tab/>
         </w:r>
         <w:r>
-          <w:t xml:space="preserve">67</w:t>
+          <w:t xml:space="preserve">87</w:t>
         </w:r>
       </w:hyperlink>
     </w:p>
@@ -1418,7 +1546,7 @@
           <w:tab/>
         </w:r>
         <w:r>
-          <w:t xml:space="preserve">70</w:t>
+          <w:t xml:space="preserve">91</w:t>
         </w:r>
       </w:hyperlink>
     </w:p>
@@ -1434,7 +1562,7 @@
           <w:tab/>
         </w:r>
         <w:r>
-          <w:t xml:space="preserve">72</w:t>
+          <w:t xml:space="preserve">94</w:t>
         </w:r>
       </w:hyperlink>
     </w:p>
@@ -1450,7 +1578,7 @@
           <w:tab/>
         </w:r>
         <w:r>
-          <w:t xml:space="preserve">73</w:t>
+          <w:t xml:space="preserve">96</w:t>
         </w:r>
       </w:hyperlink>
     </w:p>
@@ -1466,7 +1594,7 @@
           <w:tab/>
         </w:r>
         <w:r>
-          <w:t xml:space="preserve">74</w:t>
+          <w:t xml:space="preserve">97</w:t>
         </w:r>
       </w:hyperlink>
     </w:p>
@@ -1482,7 +1610,7 @@
           <w:tab/>
         </w:r>
         <w:r>
-          <w:t xml:space="preserve">74</w:t>
+          <w:t xml:space="preserve">97</w:t>
         </w:r>
       </w:hyperlink>
     </w:p>
@@ -1498,7 +1626,7 @@
           <w:tab/>
         </w:r>
         <w:r>
-          <w:t xml:space="preserve">74</w:t>
+          <w:t xml:space="preserve">97</w:t>
         </w:r>
       </w:hyperlink>
     </w:p>
@@ -1514,7 +1642,7 @@
           <w:tab/>
         </w:r>
         <w:r>
-          <w:t xml:space="preserve">84</w:t>
+          <w:t xml:space="preserve">107</w:t>
         </w:r>
       </w:hyperlink>
     </w:p>
@@ -1530,7 +1658,7 @@
           <w:tab/>
         </w:r>
         <w:r>
-          <w:t xml:space="preserve">85</w:t>
+          <w:t xml:space="preserve">108</w:t>
         </w:r>
       </w:hyperlink>
     </w:p>
@@ -1546,7 +1674,7 @@
           <w:tab/>
         </w:r>
         <w:r>
-          <w:t xml:space="preserve">85</w:t>
+          <w:t xml:space="preserve">108</w:t>
         </w:r>
       </w:hyperlink>
     </w:p>
@@ -1562,17 +1690,17 @@
           <w:tab/>
         </w:r>
         <w:r>
-          <w:t xml:space="preserve">93</w:t>
+          <w:t xml:space="preserve">117</w:t>
         </w:r>
       </w:hyperlink>
+      <w:r>
+        <w:fldChar w:fldCharType="end"/>
+      </w:r>
     </w:p>
     <w:p>
       <w:pPr>
         <w:ind w:firstLine="0"/>
       </w:pPr>
-      <w:r>
-        <w:fldChar w:fldCharType="end"/>
-      </w:r>
     </w:p>
     <w:p>
       <w:pPr>
@@ -2217,9 +2345,11 @@
       <w:pPr>
         <w:pStyle w:val="Heading2"/>
       </w:pPr>
+      <w:bookmarkStart w:id="192" w:name="_Toc20000"/>
       <w:r>
         <w:t xml:space="preserve">2.8 Explicabilidad, diagnóstico del ajuste y análisis de sensibilidad</w:t>
       </w:r>
+      <w:bookmarkEnd w:id="192"/>
     </w:p>
     <w:p>
       <w:pPr/>
@@ -2394,7 +2524,7 @@
     <w:p>
       <w:pPr/>
       <w:r>
-        <w:t>La revisión permite concluir que la predicción de no-show y el ruteo y asignación de personal de salud domiciliario son dos líneas de trabajo maduras, con marcos y comunidades propios. En las fuentes revisadas, los estudios de predicción (Salazar et al., 2022; Deina et al., 2024; Yang et al., 2024; Liu et al., 2022) se detienen en el modelo o en intervenciones genéricas como recordatorios y sobreagendamiento, y los de ruteo (Fikar y Hirsch, 2017; Demirbilek et al., 2021; Masmoudi et al., 2024) optimizan asignaciones, tiempos y visitas sin usar una probabilidad de inasistencia predicha. Dentro de las fuentes revisadas por este proyecto no se identificó un estudio que conecte ambas líneas, lo que no excluye que exista; por eso la brecha se plantea como una oportunidad acotada al alcance de esta revisión.</w:t>
+        <w:t>La revisión permite concluir que la predicción de no-show y el ruteo y asignación de personal de salud domiciliario son dos líneas de trabajo maduras, con marcos y comunidades propios. En las fuentes revisadas, los estudios de predicción (Salazar et al., 2022; Deina et al., 2024; Yang et al., 2024; Liu et al., 2022) se detienen en el modelo o en intervenciones genéricas como recordatorios y sobreagendamiento, y los de ruteo (Fikar y Hirsch, 2017; Demirbilek et al., 2021; Masmoudi et al., 2024) optimizan asignaciones, tiempos y visitas sin usar una probabilidad de inasistencia predicha. Dentro de las fuentes revisadas por este proyecto no se identificó un estudio que conecte ambas líneas, lo que no excluye que exista; por eso la brecha se plantea como una oportunidad acotada al alcance de esta revisión. La Tabla 1 resume la síntesis.</w:t>
       </w:r>
     </w:p>
     <w:p>
@@ -3220,7 +3350,7 @@
     <w:p>
       <w:pPr/>
       <w:r>
-        <w:t>Para verificar de forma explícita que el desarrollo presentado en las unidades 2 y 3 efectivamente responde a lo planteado en las secciones 1.3, 5.1 y 5.2, se presenta la siguiente matriz de trazabilidad, que vincula cada objetivo y cada pregunta de investigación con el capítulo donde se aborda y con la evidencia concreta (cifra, tabla o figura) que respalda esa respuesta.</w:t>
+        <w:t>Para verificar de forma explícita que el desarrollo presentado en las unidades 2 y 3 efectivamente responde a lo planteado en las secciones 1.3, 5.1 y 5.2, se presenta la siguiente matriz de trazabilidad, que vincula cada objetivo y cada pregunta de investigación con el capítulo donde se aborda y con la evidencia concreta (cifra, tabla o figura) que respalda esa respuesta (Tabla 3).</w:t>
       </w:r>
     </w:p>
     <w:p>
@@ -3979,7 +4109,7 @@
     <w:p>
       <w:pPr/>
       <w:r>
-        <w:t>El proyecto se organiza en 6 semanas, alineadas a las cuatro unidades de la asignatura y con entregables semanales evaluables.</w:t>
+        <w:t>El proyecto se organiza en 6 semanas, alineadas a las cuatro unidades de la asignatura y con entregables semanales evaluables (Tabla 4).</w:t>
       </w:r>
     </w:p>
     <w:p>
@@ -4872,7 +5002,7 @@
     <w:p>
       <w:pPr/>
       <w:r>
-        <w:t>El dataset limpio contiene 110,526 citas. La edad promedio de los pacientes es de 37.1 años (mediana de 37, desviación estándar de 23.1), con una alta concentración de citas de menores de un año, que corresponden a valoraciones pediátricas tempranas. El 65.0% de las citas corresponden a pacientes de género femenino, reflejando la composición típica de la demanda de servicios ambulatorios de salud. En el 9.8% de las citas el paciente participa en el programa social Bolsa Família; el 19.7% de las citas corresponde a pacientes con hipertensión registrada, el 7.2% con diabetes, el 3.0% con alcoholismo y el 2.0% con alguna discapacidad registrada. El 32.1% de las citas recibió un recordatorio por SMS. Las citas provienen de 81 barrios distintos de la ciudad de Vitória.</w:t>
+        <w:t>El dataset limpio contiene 110,526 citas. La edad promedio de los pacientes es de 37.1 años (mediana de 37, desviación estándar de 23.1), con una alta concentración de citas de menores de un año, que corresponden a valoraciones pediátricas tempranas. El 65.0% de las citas corresponden a pacientes de género femenino, reflejando la composición típica de la demanda de servicios ambulatorios de salud. En el 9.8% de las citas el paciente participa en el programa social Bolsa Família; el 19.7% de las citas corresponde a pacientes con hipertensión registrada, el 7.2% con diabetes, el 3.0% con alcoholismo y el 2.0% con alguna discapacidad registrada. El 32.1% de las citas recibió un recordatorio por SMS. Las citas provienen de 81 barrios distintos de la ciudad de Vitória. La Figura 2 muestra la distribución de la edad de los pacientes.</w:t>
       </w:r>
     </w:p>
     <w:p>
@@ -5328,7 +5458,7 @@
     <w:p>
       <w:pPr/>
       <w:r>
-        <w:t>Para el motor de asignación se construyó un entorno a partir de dos fuentes públicas reales, consultadas por el script del Anexo C. La primera es el NPI Registry de CMS (a través de su API pública), del cual se obtuvieron 1,200 registros de Nurse Practitioners individuales con consultorio en Ohio (el máximo que permite la paginación de la API, consulta del 18 de septiembre de 2026); esos registros contienen 309 códigos postales distintos, 306 de los cuales tienen coordenadas en el Gazetteer, y 15 de ellos se sortearon como sedes simuladas de NP. Como el contenido del registro cambia con el tiempo (una nueva consulta del 25 de septiembre de 2026 devolvió 310 códigos postales, 307 con coordenadas), los 15 códigos postales sorteados en la consulta original quedan fijados en el código del Anexo C, de modo que la simulación se reproduce de forma exacta. La segunda es el archivo Gazetteer de ZCTA del U.S. Census Bureau (edición 2023), del cual se obtuvieron las coordenadas oficiales de centroide de cada código postal, tanto para las 15 sedes como para 300 códigos postales de Ohio sorteados sin reemplazo como solicitudes de visita. A cada solicitud se le asocia, en cada réplica de la simulación, la cita de un paciente del conjunto de prueba, con su riesgo predicho y su desenlace observado (capítulo 15). No se vincula ninguna ubicación geográfica a un paciente real ni a un proveedor identificado individualmente: solo se reutiliza el código postal en el que existe al menos un NP registrado, no la identidad de ningún profesional.</w:t>
+        <w:t>Para el motor de asignación se construyó un entorno a partir de dos fuentes públicas reales, consultadas por el script del Anexo C. La primera es el NPI Registry de los Centers for Medicare &amp; Medicaid Services (CMS, s. f.), a través de su API pública, del cual se obtuvieron 1,200 registros de Nurse Practitioners individuales con consultorio en Ohio (el máximo que permite la paginación de la API, consulta del 18 de septiembre de 2026); esos registros contienen 309 códigos postales distintos, 306 de los cuales tienen coordenadas en el Gazetteer, y 15 de ellos se sortearon como sedes simuladas de NP. Como el contenido del registro cambia con el tiempo (una nueva consulta del 25 de septiembre de 2026 devolvió 310 códigos postales, 307 con coordenadas), los 15 códigos postales sorteados en la consulta original quedan fijados en el código del Anexo C, de modo que la simulación se reproduce de forma exacta. La segunda es el archivo Gazetteer de ZCTA del U.S. Census Bureau (edición 2023), del cual se obtuvieron las coordenadas oficiales de centroide de cada código postal, tanto para las 15 sedes como para 300 códigos postales de Ohio sorteados sin reemplazo como solicitudes de visita. A cada solicitud se le asocia, en cada réplica de la simulación, la cita de un paciente del conjunto de prueba, con su riesgo predicho y su desenlace observado (capítulo 15). No se vincula ninguna ubicación geográfica a un paciente real ni a un proveedor identificado individualmente: solo se reutiliza el código postal en el que existe al menos un NP registrado, no la identidad de ningún profesional.</w:t>
       </w:r>
     </w:p>
     <w:p>
@@ -6236,9 +6366,11 @@
       <w:pPr>
         <w:pStyle w:val="Heading2"/>
       </w:pPr>
+      <w:bookmarkStart w:id="193" w:name="_Toc20001"/>
       <w:r>
         <w:t xml:space="preserve">11.5 Implementación del sistema e interfaz de usuario</w:t>
       </w:r>
+      <w:bookmarkEnd w:id="193"/>
     </w:p>
     <w:p>
       <w:pPr/>
@@ -9644,9 +9776,11 @@
       <w:pPr>
         <w:pStyle w:val="Heading2"/>
       </w:pPr>
+      <w:bookmarkStart w:id="194" w:name="_Toc20002"/>
       <w:r>
         <w:t xml:space="preserve">13.4 Diagnóstico del ajuste con curvas de aprendizaje</w:t>
       </w:r>
+      <w:bookmarkEnd w:id="194"/>
     </w:p>
     <w:p>
       <w:pPr/>
@@ -11860,9 +11994,11 @@
       <w:pPr>
         <w:pStyle w:val="Heading2"/>
       </w:pPr>
+      <w:bookmarkStart w:id="195" w:name="_Toc20003"/>
       <w:r>
         <w:t xml:space="preserve">14.5 Análisis de sensibilidad de hiperparámetros</w:t>
       </w:r>
+      <w:bookmarkEnd w:id="195"/>
     </w:p>
     <w:p>
       <w:pPr/>
@@ -13214,7 +13350,7 @@
     <w:p>
       <w:pPr/>
       <w:r>
-        <w:t>Como el 20% de citas de mayor riesgo captura el 38.3% de las inasistencias reales del conjunto de prueba (una razón de 1.9 veces frente al azar), la reducción de la política por riesgo es aproximadamente 0.25 × 0.383 = 9.6%, mientras que la selección al azar da 0.25 × 0.20 = 5.0%. Frente al azar, el valor atribuible al modelo es la diferencia entre ambas (unos 4.6 puntos porcentuales), no la reducción total. Una política que solo usa la distancia, sin ningún modelo, logra 8.9%, de modo que la priorización por riesgo por sí sola apenas la supera (0.8 puntos). Combinar el riesgo con la distancia mejora el resultado hasta 12.6%, porque prioriza las visitas donde una inasistencia es más costosa, y aun así queda por debajo de la cota óptima (24.8%), que exigiría conocer de antemano quién faltará. Frente a la mejor política que no usa el modelo (solo distancia), combinar el riesgo aporta unos 3.7 puntos porcentuales, que es la medida más exigente del valor del modelo en este escenario.</w:t>
+        <w:t>La Tabla 17 y la Figura 23 comparan las cinco políticas. Como el 20% de citas de mayor riesgo captura el 38.3% de las inasistencias reales del conjunto de prueba (una razón de 1.9 veces frente al azar), la reducción de la política por riesgo es aproximadamente 0.25 × 0.383 = 9.6%, mientras que la selección al azar da 0.25 × 0.20 = 5.0%. Frente al azar, el valor atribuible al modelo es la diferencia entre ambas (unos 4.6 puntos porcentuales), no la reducción total. Una política que solo usa la distancia, sin ningún modelo, logra 8.9%, de modo que la priorización por riesgo por sí sola apenas la supera (0.8 puntos). Combinar el riesgo con la distancia mejora el resultado hasta 12.6%, porque prioriza las visitas donde una inasistencia es más costosa, y aun así queda por debajo de la cota óptima (24.8%), que exigiría conocer de antemano quién faltará. Frente a la mejor política que no usa el modelo (solo distancia), combinar el riesgo aporta unos 3.7 puntos porcentuales, que es la medida más exigente del valor del modelo en este escenario.</w:t>
       </w:r>
     </w:p>
     <w:p>
@@ -14327,9 +14463,11 @@
       <w:pPr>
         <w:pStyle w:val="Heading2"/>
       </w:pPr>
+      <w:bookmarkStart w:id="196" w:name="_Toc20004"/>
       <w:r>
         <w:t xml:space="preserve">17.5 Transparencia y explicabilidad</w:t>
       </w:r>
+      <w:bookmarkEnd w:id="196"/>
     </w:p>
     <w:p>
       <w:pPr/>
@@ -14341,9 +14479,11 @@
       <w:pPr>
         <w:pStyle w:val="Heading2"/>
       </w:pPr>
+      <w:bookmarkStart w:id="197" w:name="_Toc20005"/>
       <w:r>
         <w:t xml:space="preserve">17.6 Responsabilidad y monitoreo</w:t>
       </w:r>
+      <w:bookmarkEnd w:id="197"/>
     </w:p>
     <w:p>
       <w:pPr/>
@@ -14395,9 +14535,11 @@
       <w:pPr>
         <w:pStyle w:val="Heading2"/>
       </w:pPr>
+      <w:bookmarkStart w:id="198" w:name="_Toc20006"/>
       <w:r>
         <w:t xml:space="preserve">17.7 Uso dual y mal uso</w:t>
       </w:r>
+      <w:bookmarkEnd w:id="198"/>
     </w:p>
     <w:p>
       <w:pPr/>
@@ -14409,9 +14551,11 @@
       <w:pPr>
         <w:pStyle w:val="Heading2"/>
       </w:pPr>
+      <w:bookmarkStart w:id="199" w:name="_Toc20007"/>
       <w:r>
         <w:t xml:space="preserve">17.8 Casos en que no debe usarse el modelo</w:t>
       </w:r>
+      <w:bookmarkEnd w:id="199"/>
     </w:p>
     <w:p>
       <w:pPr>

</xml_diff>

<commit_message>
Precisión en las afirmaciones de equidad: la mitigación reduce la brecha de cobertura, no la elimina
</commit_message>
<xml_diff>
--- a/results/reports/informe_proyecto_integrador.docx
+++ b/results/reports/informe_proyecto_integrador.docx
@@ -9698,7 +9698,7 @@
     <w:p>
       <w:pPr/>
       <w:r>
-        <w:t>Con umbrales por grupo, la detección de inasistencias de los pacientes de 65 años o más sube de 30.6% a 74.0%, y todos los grupos quedan entre 70.3% y 74.0% (Figura 14). El costo es explícito: el porcentaje total de citas señaladas pasa de 43.0% a 45.1% y la precisión global baja de 0.334 a 0.320, porque el sistema contacta a más adultos mayores con menor tasa base de inasistencia. La mitigación corrige la desigualdad en la cobertura, pero no la menor discriminación del modelo en ese grupo (AUC de 0.707), que depende de la información disponible.</w:t>
+        <w:t>Con umbrales por grupo, la detección de inasistencias de los pacientes de 65 años o más sube de 30.6% a 74.0%, y todos los grupos quedan entre 70.3% y 74.0% (Figura 14). El costo es explícito: el porcentaje total de citas señaladas pasa de 43.0% a 45.1% y la precisión global baja de 0.334 a 0.320, porque el sistema contacta a más adultos mayores con menor tasa base de inasistencia. La mitigación reduce en gran medida la desigualdad en la cobertura, aunque sin eliminarla del todo (queda una diferencia de 3.7 puntos entre grupos), y no corrige la menor discriminación del modelo en ese grupo (AUC de 0.707), que depende de la información disponible.</w:t>
       </w:r>
     </w:p>
     <w:p>
@@ -13950,7 +13950,7 @@
     <w:p>
       <w:pPr/>
       <w:r>
-        <w:t>Cabe precisar qué variables usa el modelo. No se utilizaron raza ni etnia (no están disponibles), pero sí género y edad, asociadas de forma directa al fenómeno clínico modelado, y también la participación en el programa social Bolsa Família y la frecuencia del barrio, que actúan como indicadores indirectos de condición socioeconómica y territorio. Por eso el sistema no puede describirse como libre de variables socioeconómicas, y la verificación por subgrupos debe extenderse a esos ejes en una implementación real. Como mitigación, el sistema ya implementa umbrales por grupo de edad (sección 13.3.3), activados por defecto en la interfaz, que igualan la cobertura entre grupos (recall de 70.3% a 74.0%, frente a 30.6% a 90.9% con un umbral único). Quedan pendientes la recolección de variables adicionales específicas para adultos mayores (sección 19) y el monitoreo continuo del desempeño por subgrupo (sección 17.6).</w:t>
+        <w:t>Cabe precisar qué variables usa el modelo. No se utilizaron raza ni etnia (no están disponibles), pero sí género y edad, asociadas de forma directa al fenómeno clínico modelado, y también la participación en el programa social Bolsa Família y la frecuencia del barrio, que actúan como indicadores indirectos de condición socioeconómica y territorio. Por eso el sistema no puede describirse como libre de variables socioeconómicas, y la verificación por subgrupos debe extenderse a esos ejes en una implementación real. Como mitigación, el sistema ya implementa umbrales por grupo de edad (sección 13.3.3), activados por defecto en la interfaz, que reducen la brecha de cobertura entre grupos (recall de 70.3% a 74.0%, frente a 30.6% a 90.9% con un umbral único). Quedan pendientes la recolección de variables adicionales específicas para adultos mayores (sección 19) y el monitoreo continuo del desempeño por subgrupo (sección 17.6).</w:t>
       </w:r>
     </w:p>
     <w:p>
@@ -14213,7 +14213,7 @@
               <w:jc w:val="left"/>
             </w:pPr>
             <w:r>
-              <w:t xml:space="preserve">Igual cobertura de confirmación con la mitigación</w:t>
+              <w:t>Cobertura similar a la del resto con la mitigación</w:t>
             </w:r>
           </w:p>
         </w:tc>

</xml_diff>

<commit_message>
Revisión final: cifras de sensibilidad, conteo de pruebas, redacción de resultados simulados y guion del pitch
Co-Authored-By: Claude Opus 5.5 <noreply@anthropic.com>
Claude-Session: https://claude.ai/code/session_01FSRPTc1tGoUL6rovkikLt3
</commit_message>
<xml_diff>
--- a/results/reports/informe_proyecto_integrador.docx
+++ b/results/reports/informe_proyecto_integrador.docx
@@ -6596,7 +6596,7 @@
               <w:jc w:val="left"/>
             </w:pPr>
             <w:r>
-              <w:t xml:space="preserve">Métricas en prueba, calibración, importancia, SHAP, equidad por grupo y simulación</w:t>
+              <w:t>Métricas en prueba, calibración, importancia, SHAP, equidad por edad, sexo y proxies socioeconómicos, y simulación con análisis de sensibilidad</w:t>
             </w:r>
           </w:p>
         </w:tc>
@@ -6789,13 +6789,13 @@
         <w:t xml:space="preserve">Nota. </w:t>
       </w:r>
       <w:r>
-        <w:t>Código con estilo PEP 8 verificado, documentado con docstrings y cubierto por 18 pruebas unitarias sobre el procesamiento de datos, el modelo y la interfaz.</w:t>
+        <w:t>Código con estilo PEP 8 verificado, documentado con docstrings y cubierto por 21 pruebas unitarias sobre el procesamiento de datos, el modelo, la evaluación de equidad y la interfaz.</w:t>
       </w:r>
     </w:p>
     <w:p>
       <w:pPr/>
       <w:r>
-        <w:t>La interfaz, desarrollada en Streamlit, permite a un coordinador de programación usar el modelo sin conocimientos técnicos (Figura 11). Tiene cuatro secciones: (1) predicción individual, con un formulario validado, tres ejemplos precargados, la probabilidad de inasistencia en un indicador, la categoría de riesgo con una sugerencia de acción y la explicación SHAP del caso; (2) priorización de un lote de visitas en formato CSV, que valida cada fila, marca la fracción a confirmar primero según riesgo por distancia y permite descargar el resultado; (3) historial y comparación de las predicciones de la sesión; y (4) una sección “Acerca del modelo” con métricas, equidad por grupo de edad y limitaciones. La interfaz aplica por defecto los umbrales por grupo de edad de la sección 13.3.3, maneja los errores con mensajes comprensibles, funciona en computadoras y celulares, en español e inglés, y no almacena ningún dato ingresado. Además, cada predicción incluye un canal de revisión que funciona como mecanismo de apelación: el usuario registra un motivo predefinido (por ejemplo, que el paciente ya confirmó o que tiene una barrera de acceso) y un comentario sin datos identificables; la solicitud queda pendiente de revisión humana y se descarga en CSV desde el historial.</w:t>
+        <w:t>La interfaz, desarrollada en Streamlit, permite a un coordinador de programación usar el modelo sin conocimientos técnicos (Figura 11). Tiene cuatro secciones: (1) predicción individual, con un formulario validado, tres ejemplos precargados, la probabilidad de inasistencia en un indicador, la categoría de riesgo con una sugerencia de acción y la explicación SHAP del caso; (2) priorización de un lote de visitas en formato CSV, que valida cada fila, marca la fracción a confirmar primero según riesgo por distancia y permite descargar el resultado; (3) historial y comparación de las predicciones de la sesión; y (4) una sección “Acerca del modelo” con métricas, equidad por edad, sexo y proxies socioeconómicos, y limitaciones. La interfaz aplica por defecto los umbrales por grupo de edad de la sección 13.3.3, maneja los errores con mensajes comprensibles, funciona en computadoras y celulares, en español e inglés, y no almacena ningún dato ingresado. Además, cada predicción incluye un canal de revisión que funciona como mecanismo de apelación: el usuario registra un motivo predefinido (por ejemplo, que el paciente ya confirmó o que tiene una barrera de acceso) y un comentario sin datos identificables; la solicitud queda pendiente de revisión humana y se descarga en CSV desde el historial.</w:t>
       </w:r>
     </w:p>
     <w:p>
@@ -13919,7 +13919,7 @@
     <w:p>
       <w:pPr/>
       <w:r>
-        <w:t>Como la reducción de 25% es un supuesto y no un resultado de este proyecto, la Tabla 18 repite la simulación con reducciones de 10% y 40%. Como el beneficio es proporcional al efecto supuesto, su magnitud cambia mucho (la política combinada pasa de 5.0% a 20.0%), pero el orden de las políticas se mantiene en los tres escenarios (al azar, solo distancia, por riesgo y riesgo multiplicado por distancia), y la política combinada supera a la de solo distancia por 1.5, 3.7 y 5.8 puntos porcentuales. Si se ampliara la capacidad de contacto a 30% de las solicitudes, la reducción por riesgo sube a 13.5% (7.5% al azar y 12.3% solo por distancia), y si se redujera a 10% de las solicitudes, baja a 5.3% (2.5% al azar y 4.9% solo por distancia).</w:t>
+        <w:t>Como la reducción de 25% es un supuesto y no un resultado de este proyecto, la Tabla 18 repite la simulación con reducciones de 10% y 40%. Como el beneficio es proporcional al efecto supuesto, su magnitud cambia mucho (la política combinada pasa de 5.0% a 20.0%), pero el orden de las políticas se mantiene en los tres escenarios (al azar, solo distancia, por riesgo y riesgo multiplicado por distancia), y la política combinada supera a la de solo distancia por 1.4, 3.7 y 5.8 puntos porcentuales. Si se ampliara la capacidad de contacto a 30% de las solicitudes, la reducción por riesgo sube a 13.5% (7.5% al azar y 12.3% solo por distancia), y si se redujera a 10% de las solicitudes, baja a 5.3% (2.5% al azar y 4.9% solo por distancia).</w:t>
       </w:r>
     </w:p>
     <w:p>
@@ -14460,7 +14460,7 @@
     <w:p>
       <w:pPr/>
       <w:r>
-        <w:t>Aplicando el principio de beneficencia, si la reducción de desperdicio de desplazamiento observada en la simulación (9.6%, capítulo 15) se sostuviera en una implementación real con las salvaguardas anteriores, el impacto esperado sería una mayor cantidad de visitas efectivas por NP disponible, lo que en un programa de valoración de salud domiciliaria se traduce en mejor cobertura de la población atendida sin necesidad de contratar personal adicional. Esa cifra es simulada y depende del supuesto de efectividad de la intervención (de 3.8% a 15.3% con 10% y 40% de efecto; sección 15.3) y solo unos 4.6 puntos porcentuales son atribuibles al modelo frente a una selección al azar (3.7 puntos si se compara la política combinada con una selección solo por distancia). El riesgo social opuesto, señalado en la sección 17.2, es que una recalibración insuficiente por edad convierta esa ganancia de eficiencia agregada en una pérdida de calidad de servicio para el subgrupo de adultos mayores, por lo que ambos efectos deben evaluarse conjuntamente, bajo el principio de justicia distributiva, antes de cualquier decisión de adopción. La mitigación implementada reduce ese riesgo, al costo de señalar un 2.1% más de citas.</w:t>
+        <w:t>Aplicando el principio de beneficencia, si la reducción de desperdicio de desplazamiento obtenida en la simulación (9.6%, capítulo 15) se sostuviera en una implementación real con las salvaguardas anteriores, el impacto esperado sería una mayor cantidad de visitas efectivas por NP disponible, lo que en un programa de valoración de salud domiciliaria se traduce en mejor cobertura de la población atendida sin necesidad de contratar personal adicional. Esa cifra es simulada y depende del supuesto de efectividad de la intervención (de 3.8% a 15.3% con 10% y 40% de efecto; sección 15.3) y solo unos 4.6 puntos porcentuales son atribuibles al modelo frente a una selección al azar (3.7 puntos si se compara la política combinada con una selección solo por distancia). El riesgo social opuesto, señalado en la sección 17.2, es que una recalibración insuficiente por edad convierta esa ganancia de eficiencia agregada en una pérdida de calidad de servicio para el subgrupo de adultos mayores, por lo que ambos efectos deben evaluarse conjuntamente, bajo el principio de justicia distributiva, antes de cualquier decisión de adopción. La mitigación implementada reduce ese riesgo, al costo de señalar un 2.1% más de citas.</w:t>
       </w:r>
     </w:p>
     <w:p>
@@ -15176,7 +15176,7 @@
         <w:pStyle w:val="ListBullet"/>
       </w:pPr>
       <w:r>
-        <w:t>El proyecto se entrega como un sistema funcional y reproducible: un repositorio con código modular, 18 pruebas unitarias y documentación, y una interfaz web que permite a un usuario no técnico estimar, explicar y priorizar el riesgo de las visitas.</w:t>
+        <w:t>El proyecto se entrega como un sistema funcional y reproducible: un repositorio con código modular, 21 pruebas unitarias y documentación, y una interfaz web que permite a un usuario no técnico estimar, explicar y priorizar el riesgo de las visitas.</w:t>
       </w:r>
     </w:p>
     <w:p>
@@ -15184,7 +15184,7 @@
         <w:pStyle w:val="ListBullet"/>
       </w:pPr>
       <w:r>
-        <w:t>Las tres preguntas de investigación planteadas en la sección 1.3 se responden dentro del alcance del proyecto: sí es posible construir el modelo (con un desempeño moderado), la antelación y la edad son las variables más influyentes, y priorizar por riesgo reduce el desperdicio esperado en 9.6% (12.6% al combinarlo con la distancia, frente a 8.9% de usar solo la distancia), con implicaciones de equidad que deben gestionarse.</w:t>
+        <w:t>Las tres preguntas de investigación planteadas en la sección 1.3 se responden dentro del alcance del proyecto: sí es posible construir el modelo (con un desempeño moderado), la antelación y la edad son las variables más influyentes, y, en la simulación, priorizar por riesgo reduce el desperdicio esperado en 9.6% (12.6% al combinarlo con la distancia, frente a 8.9% de usar solo la distancia), con implicaciones de equidad que deben gestionarse.</w:t>
       </w:r>
     </w:p>
     <w:p>
@@ -16562,7 +16562,7 @@
     <w:p>
       <w:pPr/>
       <w:r>
-        <w:t>El repositorio organiza el código del Anexo C en módulos (Tabla 7), incluye los cinco notebooks ejecutados, los modelos entrenados, la interfaz, 18 pruebas unitarias (pytest) y la documentación técnica, y reproduce exactamente las cifras de este documento. Las secciones 11.5, 13.3.3 (incluido el recall con umbrales por edad en los demás ejes), 13.4 y 14.5 y los valores SHAP de la sección 11.3 se obtuvieron con ese repositorio, sobre los mismos datos, la misma partición y el mismo modelo final. Para instalarlo y ejecutarlo: pip install -r requirements.txt; streamlit run app/app.py para la interfaz; python -m src.train y python -m src.evaluate para reentrenar y evaluar; y pytest para las pruebas.</w:t>
+        <w:t>El repositorio organiza el código del Anexo C en módulos (Tabla 7), incluye los cinco notebooks ejecutados, los modelos entrenados, la interfaz, 21 pruebas unitarias (pytest) y la documentación técnica, y reproduce exactamente las cifras de este documento. Las secciones 11.5, 13.3.3 (incluido el recall con umbrales por edad en los demás ejes), 13.4 y 14.5 y los valores SHAP de la sección 11.3 se obtuvieron con ese repositorio, sobre los mismos datos, la misma partición y el mismo modelo final. Para instalarlo y ejecutarlo: pip install -r requirements.txt; streamlit run app/app.py para la interfaz; python -m src.train y python -m src.evaluate para reentrenar y evaluar; y pytest para las pruebas.</w:t>
       </w:r>
     </w:p>
     <w:p>

</xml_diff>

<commit_message>
Informe y workshop con el conteo actualizado de pruebas (25)
Co-Authored-By: Claude Opus 5.5 <noreply@anthropic.com>
Claude-Session: https://claude.ai/code/session_01FSRPTc1tGoUL6rovkikLt3
</commit_message>
<xml_diff>
--- a/results/reports/informe_proyecto_integrador.docx
+++ b/results/reports/informe_proyecto_integrador.docx
@@ -6789,7 +6789,7 @@
         <w:t xml:space="preserve">Nota. </w:t>
       </w:r>
       <w:r>
-        <w:t>Código con estilo PEP 8 verificado, documentado con docstrings y cubierto por 21 pruebas unitarias sobre el procesamiento de datos, el modelo, la evaluación de equidad y la interfaz.</w:t>
+        <w:t>Código con estilo PEP 8 verificado, documentado con docstrings y cubierto por 25 pruebas unitarias sobre el procesamiento de datos, el modelo, la evaluación de equidad y la interfaz.</w:t>
       </w:r>
     </w:p>
     <w:p>
@@ -15176,7 +15176,7 @@
         <w:pStyle w:val="ListBullet"/>
       </w:pPr>
       <w:r>
-        <w:t>El proyecto se entrega como un sistema funcional y reproducible: un repositorio con código modular, 21 pruebas unitarias y documentación, y una interfaz web que permite a un usuario no técnico estimar, explicar y priorizar el riesgo de las visitas.</w:t>
+        <w:t>El proyecto se entrega como un sistema funcional y reproducible: un repositorio con código modular, 25 pruebas unitarias y documentación, y una interfaz web que permite a un usuario no técnico estimar, explicar y priorizar el riesgo de las visitas.</w:t>
       </w:r>
     </w:p>
     <w:p>
@@ -16562,7 +16562,7 @@
     <w:p>
       <w:pPr/>
       <w:r>
-        <w:t>El repositorio organiza el código del Anexo C en módulos (Tabla 7), incluye los cinco notebooks ejecutados, los modelos entrenados, la interfaz, 21 pruebas unitarias (pytest) y la documentación técnica, y reproduce exactamente las cifras de este documento. Las secciones 11.5, 13.3.3 (incluido el recall con umbrales por edad en los demás ejes), 13.4 y 14.5 y los valores SHAP de la sección 11.3 se obtuvieron con ese repositorio, sobre los mismos datos, la misma partición y el mismo modelo final. Para instalarlo y ejecutarlo: pip install -r requirements.txt; streamlit run app/app.py para la interfaz; python -m src.train y python -m src.evaluate para reentrenar y evaluar; y pytest para las pruebas.</w:t>
+        <w:t>El repositorio organiza el código del Anexo C en módulos (Tabla 7), incluye los cinco notebooks ejecutados, los modelos entrenados, la interfaz, 25 pruebas unitarias (pytest) y la documentación técnica, y reproduce exactamente las cifras de este documento. Las secciones 11.5, 13.3.3 (incluido el recall con umbrales por edad en los demás ejes), 13.4 y 14.5 y los valores SHAP de la sección 11.3 se obtuvieron con ese repositorio, sobre los mismos datos, la misma partición y el mismo modelo final. Para instalarlo y ejecutarlo: pip install -r requirements.txt; streamlit run app/app.py para la interfaz; python -m src.train y python -m src.evaluate para reentrenar y evaluar; y pytest para las pruebas.</w:t>
       </w:r>
     </w:p>
     <w:p>

</xml_diff>

<commit_message>
Enlaces de los videos pitch y de respuestas en el README y el informe
</commit_message>
<xml_diff>
--- a/results/reports/informe_proyecto_integrador.docx
+++ b/results/reports/informe_proyecto_integrador.docx
@@ -1530,7 +1530,7 @@
           <w:tab/>
         </w:r>
         <w:r>
-          <w:t xml:space="preserve">92</w:t>
+          <w:t xml:space="preserve">93</w:t>
         </w:r>
       </w:hyperlink>
     </w:p>
@@ -1546,7 +1546,7 @@
           <w:tab/>
         </w:r>
         <w:r>
-          <w:t xml:space="preserve">97</w:t>
+          <w:t xml:space="preserve">98</w:t>
         </w:r>
       </w:hyperlink>
     </w:p>
@@ -1562,7 +1562,7 @@
           <w:tab/>
         </w:r>
         <w:r>
-          <w:t xml:space="preserve">100</w:t>
+          <w:t xml:space="preserve">101</w:t>
         </w:r>
       </w:hyperlink>
     </w:p>
@@ -1578,7 +1578,7 @@
           <w:tab/>
         </w:r>
         <w:r>
-          <w:t xml:space="preserve">102</w:t>
+          <w:t xml:space="preserve">103</w:t>
         </w:r>
       </w:hyperlink>
     </w:p>
@@ -1594,7 +1594,7 @@
           <w:tab/>
         </w:r>
         <w:r>
-          <w:t xml:space="preserve">103</w:t>
+          <w:t xml:space="preserve">104</w:t>
         </w:r>
       </w:hyperlink>
     </w:p>
@@ -1610,7 +1610,7 @@
           <w:tab/>
         </w:r>
         <w:r>
-          <w:t xml:space="preserve">103</w:t>
+          <w:t xml:space="preserve">104</w:t>
         </w:r>
       </w:hyperlink>
     </w:p>
@@ -1626,7 +1626,7 @@
           <w:tab/>
         </w:r>
         <w:r>
-          <w:t xml:space="preserve">103</w:t>
+          <w:t xml:space="preserve">104</w:t>
         </w:r>
       </w:hyperlink>
     </w:p>
@@ -1642,7 +1642,7 @@
           <w:tab/>
         </w:r>
         <w:r>
-          <w:t xml:space="preserve">113</w:t>
+          <w:t xml:space="preserve">114</w:t>
         </w:r>
       </w:hyperlink>
     </w:p>
@@ -1658,7 +1658,7 @@
           <w:tab/>
         </w:r>
         <w:r>
-          <w:t xml:space="preserve">114</w:t>
+          <w:t xml:space="preserve">115</w:t>
         </w:r>
       </w:hyperlink>
     </w:p>
@@ -1674,7 +1674,7 @@
           <w:tab/>
         </w:r>
         <w:r>
-          <w:t xml:space="preserve">114</w:t>
+          <w:t xml:space="preserve">115</w:t>
         </w:r>
       </w:hyperlink>
     </w:p>
@@ -1690,7 +1690,7 @@
           <w:tab/>
         </w:r>
         <w:r>
-          <w:t xml:space="preserve">124</w:t>
+          <w:t xml:space="preserve">125</w:t>
         </w:r>
       </w:hyperlink>
       <w:r>
@@ -15728,7 +15728,13 @@
     <w:p>
       <w:pPr/>
       <w:r>
-        <w:t xml:space="preserve">En el video de preguntas, el equipo responderá cada pregunta en el orden asignado, indicando su número, con respuestas directas y fundamentadas en el código, los resultados o la interfaz, y discutiendo abiertamente las limitaciones. Para prepararlo se elaboró una guía de respuestas a las preguntas más probables, incluida en el repositorio.</w:t>
+        <w:t>En el video de preguntas, el equipo responde cada pregunta en el orden asignado, indicando su número, con respuestas directas y fundamentadas en el código, los resultados o la interfaz, y discutiendo abiertamente las limitaciones. Para prepararlo se elaboró una guía de respuestas a las preguntas más probables, incluida en el repositorio.</w:t>
+      </w:r>
+    </w:p>
+    <w:p>
+      <w:pPr/>
+      <w:r>
+        <w:t>Ambos videos están publicados en YouTube como no listados: video pitch, https://youtu.be/Wis2_W0N7dg; video de respuestas, https://youtu.be/NS4ZxIF8lHk. Los enlaces también figuran en la sección 12 del README del repositorio.</w:t>
       </w:r>
     </w:p>
     <w:p>

</xml_diff>